<commit_message>
Update reports with walkthrough evidence and participant feedback
</commit_message>
<xml_diff>
--- a/docs/Implementation_Report.docx
+++ b/docs/Implementation_Report.docx
@@ -266,7 +266,7 @@
                 <w:color w:val="000000"/>
                 <w:sz w:val="16"/>
               </w:rPr>
-              <w:t>production tag when packaging completes; final test evidence</w:t>
+              <w:t>Local production tag and history bundle; production-tests.txt and persistence-check.txt</w:t>
             </w:r>
           </w:p>
         </w:tc>
@@ -739,7 +739,7 @@
                 <w:color w:val="000000"/>
                 <w:sz w:val="16"/>
               </w:rPr>
-              <w:t>persistence-check.txt when completed</w:t>
+              <w:t>persistence-check.txt: PASS T17 after Node.js restart</w:t>
             </w:r>
           </w:p>
         </w:tc>
@@ -763,12 +763,12 @@
         <w:pStyle w:val="Heading1"/>
       </w:pPr>
       <w:r>
-        <w:t>Remaining verification</w:t>
+        <w:t>CLI refinement and remaining verification</w:t>
       </w:r>
     </w:p>
     <w:p>
       <w:r>
-        <w:t>The in-app browser could not reach the local preview, so no desktop/mobile screenshot or end-to-end browser pass is claimed. Three participant sessions are not complete. Codex was used through the desktop agent in this session; the assignment specifically asks for Codex CLI, so an actual CLI review/refinement session and its log must be added if the instructor requires the CLI specifically. The final video is the student’s responsibility.</w:t>
+        <w:t>On October 10, the owner completed a guided browser walkthrough; screenshots and reported checks are recorded in the evaluation report. A subsequent genuine Codex CLI session hid the lookup form only when printing. Five static checks passed; the owner then supplied a passing print preview. See evidence/cli-print-review.md. Earlier development used desktop Codex, not CLI. Three participant evaluations and the video remain incomplete; original version tags are preserved locally and in the history bundle.</w:t>
       </w:r>
     </w:p>
     <w:p>

</xml_diff>